<commit_message>
updated live prototype ; replit demo ; readme links
</commit_message>
<xml_diff>
--- a/submission/REPLIT PROOF OF USE.docx
+++ b/submission/REPLIT PROOF OF USE.docx
@@ -113,7 +113,6 @@
         <w:rPr>
           <w:noProof/>
         </w:rPr>
-        <w:lastRenderedPageBreak/>
         <w:drawing>
           <wp:inline distT="0" distB="0" distL="0" distR="0" wp14:anchorId="37381840" wp14:editId="629A1CCB">
             <wp:extent cx="5727700" cy="2882265"/>
@@ -167,6 +166,7 @@
         <w:rPr>
           <w:noProof/>
         </w:rPr>
+        <w:lastRenderedPageBreak/>
         <w:drawing>
           <wp:inline distT="0" distB="0" distL="0" distR="0" wp14:anchorId="08BAF68D" wp14:editId="17F718E1">
             <wp:extent cx="5727700" cy="2896870"/>
@@ -215,6 +215,160 @@
             </a:graphic>
           </wp:inline>
         </w:drawing>
+      </w:r>
+      <w:r>
+        <w:rPr>
+          <w:noProof/>
+        </w:rPr>
+        <w:drawing>
+          <wp:inline distT="0" distB="0" distL="0" distR="0" wp14:anchorId="3676C534" wp14:editId="51331E1C">
+            <wp:extent cx="5731510" cy="3081020"/>
+            <wp:effectExtent l="0" t="0" r="2540" b="5080"/>
+            <wp:docPr id="1377125196" name="Picture 1"/>
+            <wp:cNvGraphicFramePr>
+              <a:graphicFrameLocks xmlns:a="http://schemas.openxmlformats.org/drawingml/2006/main" noChangeAspect="1"/>
+            </wp:cNvGraphicFramePr>
+            <a:graphic xmlns:a="http://schemas.openxmlformats.org/drawingml/2006/main">
+              <a:graphicData uri="http://schemas.openxmlformats.org/drawingml/2006/picture">
+                <pic:pic xmlns:pic="http://schemas.openxmlformats.org/drawingml/2006/picture">
+                  <pic:nvPicPr>
+                    <pic:cNvPr id="1377125196" name=""/>
+                    <pic:cNvPicPr/>
+                  </pic:nvPicPr>
+                  <pic:blipFill>
+                    <a:blip r:embed="rId8"/>
+                    <a:stretch>
+                      <a:fillRect/>
+                    </a:stretch>
+                  </pic:blipFill>
+                  <pic:spPr>
+                    <a:xfrm>
+                      <a:off x="0" y="0"/>
+                      <a:ext cx="5731510" cy="3081020"/>
+                    </a:xfrm>
+                    <a:prstGeom prst="rect">
+                      <a:avLst/>
+                    </a:prstGeom>
+                  </pic:spPr>
+                </pic:pic>
+              </a:graphicData>
+            </a:graphic>
+          </wp:inline>
+        </w:drawing>
+      </w:r>
+      <w:r>
+        <w:rPr>
+          <w:noProof/>
+        </w:rPr>
+        <w:lastRenderedPageBreak/>
+        <w:drawing>
+          <wp:inline distT="0" distB="0" distL="0" distR="0" wp14:anchorId="5AA90011" wp14:editId="67F3FBD0">
+            <wp:extent cx="5723890" cy="3075940"/>
+            <wp:effectExtent l="0" t="0" r="0" b="0"/>
+            <wp:docPr id="1113957573" name="Picture 1"/>
+            <wp:cNvGraphicFramePr>
+              <a:graphicFrameLocks xmlns:a="http://schemas.openxmlformats.org/drawingml/2006/main" noChangeAspect="1"/>
+            </wp:cNvGraphicFramePr>
+            <a:graphic xmlns:a="http://schemas.openxmlformats.org/drawingml/2006/main">
+              <a:graphicData uri="http://schemas.openxmlformats.org/drawingml/2006/picture">
+                <pic:pic xmlns:pic="http://schemas.openxmlformats.org/drawingml/2006/picture">
+                  <pic:nvPicPr>
+                    <pic:cNvPr id="0" name="Picture 1"/>
+                    <pic:cNvPicPr>
+                      <a:picLocks noChangeAspect="1" noChangeArrowheads="1"/>
+                    </pic:cNvPicPr>
+                  </pic:nvPicPr>
+                  <pic:blipFill>
+                    <a:blip r:embed="rId9" cstate="print">
+                      <a:extLst>
+                        <a:ext uri="{28A0092B-C50C-407E-A947-70E740481C1C}">
+                          <a14:useLocalDpi xmlns:a14="http://schemas.microsoft.com/office/drawing/2010/main" val="0"/>
+                        </a:ext>
+                      </a:extLst>
+                    </a:blip>
+                    <a:srcRect/>
+                    <a:stretch>
+                      <a:fillRect/>
+                    </a:stretch>
+                  </pic:blipFill>
+                  <pic:spPr bwMode="auto">
+                    <a:xfrm>
+                      <a:off x="0" y="0"/>
+                      <a:ext cx="5723890" cy="3075940"/>
+                    </a:xfrm>
+                    <a:prstGeom prst="rect">
+                      <a:avLst/>
+                    </a:prstGeom>
+                    <a:noFill/>
+                    <a:ln>
+                      <a:noFill/>
+                    </a:ln>
+                  </pic:spPr>
+                </pic:pic>
+              </a:graphicData>
+            </a:graphic>
+          </wp:inline>
+        </w:drawing>
+      </w:r>
+      <w:r>
+        <w:rPr>
+          <w:noProof/>
+        </w:rPr>
+        <w:drawing>
+          <wp:inline distT="0" distB="0" distL="0" distR="0" wp14:anchorId="25FFCC62" wp14:editId="14C2F342">
+            <wp:extent cx="5731510" cy="3081020"/>
+            <wp:effectExtent l="0" t="0" r="2540" b="5080"/>
+            <wp:docPr id="2018988296" name="Picture 1"/>
+            <wp:cNvGraphicFramePr>
+              <a:graphicFrameLocks xmlns:a="http://schemas.openxmlformats.org/drawingml/2006/main" noChangeAspect="1"/>
+            </wp:cNvGraphicFramePr>
+            <a:graphic xmlns:a="http://schemas.openxmlformats.org/drawingml/2006/main">
+              <a:graphicData uri="http://schemas.openxmlformats.org/drawingml/2006/picture">
+                <pic:pic xmlns:pic="http://schemas.openxmlformats.org/drawingml/2006/picture">
+                  <pic:nvPicPr>
+                    <pic:cNvPr id="2018988296" name=""/>
+                    <pic:cNvPicPr/>
+                  </pic:nvPicPr>
+                  <pic:blipFill>
+                    <a:blip r:embed="rId10"/>
+                    <a:stretch>
+                      <a:fillRect/>
+                    </a:stretch>
+                  </pic:blipFill>
+                  <pic:spPr>
+                    <a:xfrm>
+                      <a:off x="0" y="0"/>
+                      <a:ext cx="5731510" cy="3081020"/>
+                    </a:xfrm>
+                    <a:prstGeom prst="rect">
+                      <a:avLst/>
+                    </a:prstGeom>
+                  </pic:spPr>
+                </pic:pic>
+              </a:graphicData>
+            </a:graphic>
+          </wp:inline>
+        </w:drawing>
+      </w:r>
+    </w:p>
+    <w:p>
+      <w:r>
+        <w:t>Website up!</w:t>
+      </w:r>
+    </w:p>
+    <w:p>
+      <w:hyperlink r:id="rId11" w:history="1">
+        <w:r>
+          <w:rPr>
+            <w:rStyle w:val="Hyperlink"/>
+          </w:rPr>
+          <w:t>https://ai-x-global.replit.app/</w:t>
+        </w:r>
+      </w:hyperlink>
+    </w:p>
+    <w:p>
+      <w:r>
+        <w:t>AixGlobal123456789</w:t>
       </w:r>
     </w:p>
     <w:sectPr>
@@ -1144,6 +1298,29 @@
       <w:spacing w:val="5"/>
     </w:rPr>
   </w:style>
+  <w:style w:type="character" w:styleId="Hyperlink">
+    <w:name w:val="Hyperlink"/>
+    <w:basedOn w:val="DefaultParagraphFont"/>
+    <w:uiPriority w:val="99"/>
+    <w:unhideWhenUsed/>
+    <w:rsid w:val="00225969"/>
+    <w:rPr>
+      <w:color w:val="0563C1" w:themeColor="hyperlink"/>
+      <w:u w:val="single"/>
+    </w:rPr>
+  </w:style>
+  <w:style w:type="character" w:styleId="UnresolvedMention">
+    <w:name w:val="Unresolved Mention"/>
+    <w:basedOn w:val="DefaultParagraphFont"/>
+    <w:uiPriority w:val="99"/>
+    <w:semiHidden/>
+    <w:unhideWhenUsed/>
+    <w:rsid w:val="00225969"/>
+    <w:rPr>
+      <w:color w:val="605E5C"/>
+      <w:shd w:val="clear" w:color="auto" w:fill="E1DFDD"/>
+    </w:rPr>
+  </w:style>
 </w:styles>
 </file>
 

</xml_diff>